<commit_message>
docs: documenta la seccion Comparar y los retoques del Dashboard (v0.3.1)
Actualiza README, architecture, changelog (entrada 0.3.1) y roadmap (marca la
comparativa entre dos partidas como hecha). Los dos documentos Word reflejan la
nueva seccion Comparar (ruta /compare, util compareStats), el arbol de paginas y
el umbral de anomalas 240s -> 180s.

Co-Authored-By: Claude Opus 4.8 <noreply@anthropic.com>
</commit_message>
<xml_diff>
--- a/docs/RLAnalyzer-Documentacion-Tecnica.docx
+++ b/docs/RLAnalyzer-Documentacion-Tecnica.docx
@@ -10377,6 +10377,20 @@
     </w:p>
     <w:p>
       <w:pPr>
+        <w:spacing w:after="120" w:before="0"/>
+      </w:pPr>
+      <w:r>
+        <w:rPr>
+          <w:rFonts w:ascii="Arial" w:cs="Arial" w:eastAsia="Arial" w:hAnsi="Arial"/>
+          <w:color w:val="222222"/>
+          <w:sz w:val="20"/>
+          <w:szCs w:val="20"/>
+        </w:rPr>
+        <w:t xml:space="preserve">Novedades v0.3.1: nueva sección Comparar (ruta /compare) para enfrentar dos partidas (A vs B) mostrando tus stats, el total de tu equipo y el del equipo rival, con delta coloreado por métrica y un resumen automático de las mayores diferencias. No añade endpoints: reutiliza GET /api/replays/{id} y GET /api/stats/glossary, y todo el cálculo se hace en el cliente (frontend/src/utils/compareStats.js), agregando por equipo (suma para recuentos, media para boost/velocidad). Además se reduce el umbral de partida anómala de 240s a 180s y se mejoran los gráficos del Dashboard (legibilidad de tooltips, indicador de partidas anómalas, botón al visor 3D y ayuda contextual sobre anómalas).</w:t>
+      </w:r>
+    </w:p>
+    <w:p>
+      <w:pPr>
         <w:pStyle w:val="Heading2"/>
         <w:pBdr>
           <w:bottom w:val="single" w:color="00A8FF" w:sz="4" w:space="4"/>
@@ -13321,6 +13335,17 @@
                 <w:szCs w:val="20"/>
               </w:rPr>
               <w:t xml:space="preserve">Superponer dos partidas para comparar rendimiento</w:t>
+            </w:r>
+            <w:r>
+              <w:rPr>
+                <w:rFonts w:ascii="Arial" w:cs="Arial" w:eastAsia="Arial" w:hAnsi="Arial"/>
+                <w:b/>
+                <w:bCs/>
+                <w:color w:val="2E7D32"/>
+                <w:sz w:val="20"/>
+                <w:szCs w:val="20"/>
+              </w:rPr>
+              <w:t xml:space="preserve">  ✓ Hecho en v0.3.1 (sección Comparar)</w:t>
             </w:r>
           </w:p>
         </w:tc>

</xml_diff>